<commit_message>
Ukg, child dev sent for proofing
</commit_message>
<xml_diff>
--- a/child dev/Cover page NURSERY.docx
+++ b/child dev/Cover page NURSERY.docx
@@ -72,7 +72,7 @@
           </mc:Choice>
           <mc:Fallback>
             <w:pict>
-              <v:rect w14:anchorId="1862E0CA" id="Rectangle 1" o:spid="_x0000_s1026" style="position:absolute;margin-left:-5.45pt;margin-top:-4.5pt;width:370.5pt;height:515.25pt;z-index:251664384;visibility:visible;mso-wrap-style:square;mso-width-percent:0;mso-height-percent:0;mso-wrap-distance-left:9pt;mso-wrap-distance-top:0;mso-wrap-distance-right:9pt;mso-wrap-distance-bottom:0;mso-position-horizontal:absolute;mso-position-horizontal-relative:text;mso-position-vertical:absolute;mso-position-vertical-relative:text;mso-width-percent:0;mso-height-percent:0;mso-width-relative:margin;mso-height-relative:margin;v-text-anchor:middle" o:gfxdata="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" filled="f" strokecolor="windowText" strokeweight="2pt"/>
+              <v:rect w14:anchorId="50A4E41D" id="Rectangle 1" o:spid="_x0000_s1026" style="position:absolute;margin-left:-5.45pt;margin-top:-4.5pt;width:370.5pt;height:515.25pt;z-index:251664384;visibility:visible;mso-wrap-style:square;mso-width-percent:0;mso-height-percent:0;mso-wrap-distance-left:9pt;mso-wrap-distance-top:0;mso-wrap-distance-right:9pt;mso-wrap-distance-bottom:0;mso-position-horizontal:absolute;mso-position-horizontal-relative:text;mso-position-vertical:absolute;mso-position-vertical-relative:text;mso-width-percent:0;mso-height-percent:0;mso-width-relative:margin;mso-height-relative:margin;v-text-anchor:middle" o:gfxdata="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" filled="f" strokecolor="windowText" strokeweight="2pt"/>
             </w:pict>
           </mc:Fallback>
         </mc:AlternateContent>
@@ -548,7 +548,7 @@
           </mc:Choice>
           <mc:Fallback>
             <w:pict>
-              <v:rect w14:anchorId="5A83B754" id="Rectangle 2" o:spid="_x0000_s1026" style="position:absolute;margin-left:-5.25pt;margin-top:11.05pt;width:370.5pt;height:260.25pt;z-index:251665408;visibility:visible;mso-wrap-style:square;mso-width-percent:0;mso-height-percent:0;mso-wrap-distance-left:9pt;mso-wrap-distance-top:0;mso-wrap-distance-right:9pt;mso-wrap-distance-bottom:0;mso-position-horizontal:absolute;mso-position-horizontal-relative:text;mso-position-vertical:absolute;mso-position-vertical-relative:text;mso-width-percent:0;mso-height-percent:0;mso-width-relative:margin;mso-height-relative:margin;v-text-anchor:middle" o:gfxdata="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" filled="f" strokecolor="windowText" strokeweight=".25pt"/>
+              <v:rect w14:anchorId="7785D98A" id="Rectangle 2" o:spid="_x0000_s1026" style="position:absolute;margin-left:-5.25pt;margin-top:11.05pt;width:370.5pt;height:260.25pt;z-index:251665408;visibility:visible;mso-wrap-style:square;mso-width-percent:0;mso-height-percent:0;mso-wrap-distance-left:9pt;mso-wrap-distance-top:0;mso-wrap-distance-right:9pt;mso-wrap-distance-bottom:0;mso-position-horizontal:absolute;mso-position-horizontal-relative:text;mso-position-vertical:absolute;mso-position-vertical-relative:text;mso-width-percent:0;mso-height-percent:0;mso-width-relative:margin;mso-height-relative:margin;v-text-anchor:middle" o:gfxdata="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" filled="f" strokecolor="windowText" strokeweight=".25pt"/>
             </w:pict>
           </mc:Fallback>
         </mc:AlternateContent>
@@ -941,7 +941,7 @@
           </mc:Choice>
           <mc:Fallback>
             <w:pict>
-              <v:rect w14:anchorId="40EAD3DB" id="Rectangle 3" o:spid="_x0000_s1026" style="position:absolute;margin-left:.75pt;margin-top:-4.5pt;width:366pt;height:515.25pt;z-index:251661312;visibility:visible;mso-wrap-style:square;mso-height-percent:0;mso-wrap-distance-left:9pt;mso-wrap-distance-top:0;mso-wrap-distance-right:9pt;mso-wrap-distance-bottom:0;mso-position-horizontal:absolute;mso-position-horizontal-relative:text;mso-position-vertical:absolute;mso-position-vertical-relative:text;mso-height-percent:0;mso-height-relative:margin;v-text-anchor:middle" o:gfxdata="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" filled="f" strokecolor="black [3213]" strokeweight="2pt"/>
+              <v:rect w14:anchorId="442F43ED" id="Rectangle 3" o:spid="_x0000_s1026" style="position:absolute;margin-left:.75pt;margin-top:-4.5pt;width:366pt;height:515.25pt;z-index:251661312;visibility:visible;mso-wrap-style:square;mso-height-percent:0;mso-wrap-distance-left:9pt;mso-wrap-distance-top:0;mso-wrap-distance-right:9pt;mso-wrap-distance-bottom:0;mso-position-horizontal:absolute;mso-position-horizontal-relative:text;mso-position-vertical:absolute;mso-position-vertical-relative:text;mso-height-percent:0;mso-height-relative:margin;v-text-anchor:middle" o:gfxdata="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" filled="f" strokecolor="black [3213]" strokeweight="2pt"/>
             </w:pict>
           </mc:Fallback>
         </mc:AlternateContent>
@@ -1259,7 +1259,7 @@
           <w:b/>
           <w:sz w:val="36"/>
         </w:rPr>
-        <w:t>Second</w:t>
+        <w:t>Third</w:t>
       </w:r>
       <w:r>
         <w:rPr>

</xml_diff>